<commit_message>
Add evidence_sha256.csv and final lab files
</commit_message>
<xml_diff>
--- a/LAB3/11_ĐH_THMT-LAB3_1150080027_Phạm Công Nguyên.docx
+++ b/LAB3/11_ĐH_THMT-LAB3_1150080027_Phạm Công Nguyên.docx
@@ -10,23 +10,13 @@
           <w:szCs w:val="26"/>
         </w:rPr>
       </w:pPr>
-      <w:proofErr w:type="spellStart"/>
-      <w:r>
-        <w:rPr>
-          <w:rFonts w:ascii="Times New Roman" w:hAnsi="Times New Roman" w:cs="Times New Roman"/>
-          <w:sz w:val="26"/>
-          <w:szCs w:val="26"/>
-        </w:rPr>
-        <w:t>Tên</w:t>
-      </w:r>
-      <w:proofErr w:type="spellEnd"/>
-      <w:r>
-        <w:rPr>
-          <w:rFonts w:ascii="Times New Roman" w:hAnsi="Times New Roman" w:cs="Times New Roman"/>
-          <w:sz w:val="26"/>
-          <w:szCs w:val="26"/>
-        </w:rPr>
-        <w:t>: Phạm Công Nguyên</w:t>
+      <w:r>
+        <w:rPr>
+          <w:rFonts w:ascii="Times New Roman" w:hAnsi="Times New Roman" w:cs="Times New Roman"/>
+          <w:sz w:val="26"/>
+          <w:szCs w:val="26"/>
+        </w:rPr>
+        <w:t>Tên: Phạm Công Nguyên</w:t>
       </w:r>
     </w:p>
     <w:p>
@@ -37,23 +27,13 @@
           <w:szCs w:val="26"/>
         </w:rPr>
       </w:pPr>
-      <w:proofErr w:type="spellStart"/>
-      <w:r>
-        <w:rPr>
-          <w:rFonts w:ascii="Times New Roman" w:hAnsi="Times New Roman" w:cs="Times New Roman"/>
-          <w:sz w:val="26"/>
-          <w:szCs w:val="26"/>
-        </w:rPr>
-        <w:t>Lớp</w:t>
-      </w:r>
-      <w:proofErr w:type="spellEnd"/>
-      <w:r>
-        <w:rPr>
-          <w:rFonts w:ascii="Times New Roman" w:hAnsi="Times New Roman" w:cs="Times New Roman"/>
-          <w:sz w:val="26"/>
-          <w:szCs w:val="26"/>
-        </w:rPr>
-        <w:t>: 11_ĐH_THMT</w:t>
+      <w:r>
+        <w:rPr>
+          <w:rFonts w:ascii="Times New Roman" w:hAnsi="Times New Roman" w:cs="Times New Roman"/>
+          <w:sz w:val="26"/>
+          <w:szCs w:val="26"/>
+        </w:rPr>
+        <w:t>Lớp: 11_ĐH_THMT</w:t>
       </w:r>
     </w:p>
     <w:p>
@@ -127,25 +107,7 @@
           <w:sz w:val="26"/>
           <w:szCs w:val="26"/>
         </w:rPr>
-        <w:t xml:space="preserve">Link video </w:t>
-      </w:r>
-      <w:proofErr w:type="spellStart"/>
-      <w:r>
-        <w:rPr>
-          <w:rFonts w:ascii="Times New Roman" w:hAnsi="Times New Roman" w:cs="Times New Roman"/>
-          <w:sz w:val="26"/>
-          <w:szCs w:val="26"/>
-        </w:rPr>
-        <w:t>youtube</w:t>
-      </w:r>
-      <w:proofErr w:type="spellEnd"/>
-      <w:r>
-        <w:rPr>
-          <w:rFonts w:ascii="Times New Roman" w:hAnsi="Times New Roman" w:cs="Times New Roman"/>
-          <w:sz w:val="26"/>
-          <w:szCs w:val="26"/>
-        </w:rPr>
-        <w:t xml:space="preserve">: </w:t>
+        <w:t xml:space="preserve">Link video youtube: </w:t>
       </w:r>
     </w:p>
     <w:p>
@@ -174,7 +136,6 @@
         </w:rPr>
       </w:pPr>
       <w:hyperlink r:id="rId4" w:history="1">
-        <w:proofErr w:type="spellStart"/>
         <w:r>
           <w:rPr>
             <w:rStyle w:val="Hyperlink"/>
@@ -182,37 +143,7 @@
             <w:sz w:val="26"/>
             <w:szCs w:val="26"/>
           </w:rPr>
-          <w:t>Bài</w:t>
-        </w:r>
-        <w:proofErr w:type="spellEnd"/>
-        <w:r>
-          <w:rPr>
-            <w:rStyle w:val="Hyperlink"/>
-            <w:rFonts w:ascii="Times New Roman" w:hAnsi="Times New Roman" w:cs="Times New Roman"/>
-            <w:sz w:val="26"/>
-            <w:szCs w:val="26"/>
-          </w:rPr>
-          <w:t xml:space="preserve"> </w:t>
-        </w:r>
-        <w:proofErr w:type="spellStart"/>
-        <w:r>
-          <w:rPr>
-            <w:rStyle w:val="Hyperlink"/>
-            <w:rFonts w:ascii="Times New Roman" w:hAnsi="Times New Roman" w:cs="Times New Roman"/>
-            <w:sz w:val="26"/>
-            <w:szCs w:val="26"/>
-          </w:rPr>
-          <w:t>Tập</w:t>
-        </w:r>
-        <w:proofErr w:type="spellEnd"/>
-        <w:r>
-          <w:rPr>
-            <w:rStyle w:val="Hyperlink"/>
-            <w:rFonts w:ascii="Times New Roman" w:hAnsi="Times New Roman" w:cs="Times New Roman"/>
-            <w:sz w:val="26"/>
-            <w:szCs w:val="26"/>
-          </w:rPr>
-          <w:t xml:space="preserve"> ATHTTT Lab3</w:t>
+          <w:t>Bài Tập ATHTTT Lab3</w:t>
         </w:r>
       </w:hyperlink>
     </w:p>
@@ -224,68 +155,13 @@
           <w:szCs w:val="26"/>
         </w:rPr>
       </w:pPr>
-      <w:proofErr w:type="spellStart"/>
-      <w:r>
-        <w:rPr>
-          <w:rFonts w:ascii="Times New Roman" w:hAnsi="Times New Roman" w:cs="Times New Roman"/>
-          <w:sz w:val="26"/>
-          <w:szCs w:val="26"/>
-        </w:rPr>
-        <w:t>Phiên</w:t>
-      </w:r>
-      <w:proofErr w:type="spellEnd"/>
-      <w:r>
-        <w:rPr>
-          <w:rFonts w:ascii="Times New Roman" w:hAnsi="Times New Roman" w:cs="Times New Roman"/>
-          <w:sz w:val="26"/>
-          <w:szCs w:val="26"/>
-        </w:rPr>
-        <w:t xml:space="preserve"> </w:t>
-      </w:r>
-      <w:proofErr w:type="spellStart"/>
-      <w:r>
-        <w:rPr>
-          <w:rFonts w:ascii="Times New Roman" w:hAnsi="Times New Roman" w:cs="Times New Roman"/>
-          <w:sz w:val="26"/>
-          <w:szCs w:val="26"/>
-        </w:rPr>
-        <w:t>bản</w:t>
-      </w:r>
-      <w:proofErr w:type="spellEnd"/>
-      <w:r>
-        <w:rPr>
-          <w:rFonts w:ascii="Times New Roman" w:hAnsi="Times New Roman" w:cs="Times New Roman"/>
-          <w:sz w:val="26"/>
-          <w:szCs w:val="26"/>
-        </w:rPr>
-        <w:t xml:space="preserve"> </w:t>
-      </w:r>
-      <w:proofErr w:type="spellStart"/>
-      <w:r>
-        <w:rPr>
-          <w:rFonts w:ascii="Times New Roman" w:hAnsi="Times New Roman" w:cs="Times New Roman"/>
-          <w:sz w:val="26"/>
-          <w:szCs w:val="26"/>
-        </w:rPr>
-        <w:t>môi</w:t>
-      </w:r>
-      <w:proofErr w:type="spellEnd"/>
-      <w:r>
-        <w:rPr>
-          <w:rFonts w:ascii="Times New Roman" w:hAnsi="Times New Roman" w:cs="Times New Roman"/>
-          <w:sz w:val="26"/>
-          <w:szCs w:val="26"/>
-        </w:rPr>
-        <w:t xml:space="preserve"> </w:t>
-      </w:r>
-      <w:proofErr w:type="spellStart"/>
-      <w:r>
-        <w:rPr>
-          <w:rFonts w:ascii="Times New Roman" w:hAnsi="Times New Roman" w:cs="Times New Roman"/>
-          <w:sz w:val="26"/>
-          <w:szCs w:val="26"/>
-        </w:rPr>
-        <w:t>trườn</w:t>
+      <w:r>
+        <w:rPr>
+          <w:rFonts w:ascii="Times New Roman" w:hAnsi="Times New Roman" w:cs="Times New Roman"/>
+          <w:sz w:val="26"/>
+          <w:szCs w:val="26"/>
+        </w:rPr>
+        <w:t>Phiên bản môi trườn</w:t>
       </w:r>
       <w:r>
         <w:rPr>
@@ -295,58 +171,21 @@
         </w:rPr>
         <w:t>g</w:t>
       </w:r>
-      <w:proofErr w:type="spellEnd"/>
-      <w:r>
-        <w:rPr>
-          <w:rFonts w:ascii="Times New Roman" w:hAnsi="Times New Roman" w:cs="Times New Roman"/>
-          <w:sz w:val="26"/>
-          <w:szCs w:val="26"/>
-        </w:rPr>
-        <w:t xml:space="preserve"> </w:t>
-      </w:r>
-      <w:proofErr w:type="spellStart"/>
-      <w:r>
-        <w:rPr>
-          <w:rFonts w:ascii="Times New Roman" w:hAnsi="Times New Roman" w:cs="Times New Roman"/>
-          <w:sz w:val="26"/>
-          <w:szCs w:val="26"/>
-        </w:rPr>
-        <w:t>th</w:t>
-      </w:r>
-      <w:r>
-        <w:rPr>
-          <w:rFonts w:ascii="Times New Roman" w:hAnsi="Times New Roman" w:cs="Times New Roman"/>
-          <w:sz w:val="26"/>
-          <w:szCs w:val="26"/>
-        </w:rPr>
-        <w:t>ực</w:t>
-      </w:r>
-      <w:proofErr w:type="spellEnd"/>
-      <w:r>
-        <w:rPr>
-          <w:rFonts w:ascii="Times New Roman" w:hAnsi="Times New Roman" w:cs="Times New Roman"/>
-          <w:sz w:val="26"/>
-          <w:szCs w:val="26"/>
-        </w:rPr>
-        <w:t xml:space="preserve"> </w:t>
-      </w:r>
-      <w:proofErr w:type="spellStart"/>
-      <w:r>
-        <w:rPr>
-          <w:rFonts w:ascii="Times New Roman" w:hAnsi="Times New Roman" w:cs="Times New Roman"/>
-          <w:sz w:val="26"/>
-          <w:szCs w:val="26"/>
-        </w:rPr>
-        <w:t>hành</w:t>
-      </w:r>
-      <w:proofErr w:type="spellEnd"/>
-      <w:r>
-        <w:rPr>
-          <w:rFonts w:ascii="Times New Roman" w:hAnsi="Times New Roman" w:cs="Times New Roman"/>
-          <w:sz w:val="26"/>
-          <w:szCs w:val="26"/>
-        </w:rPr>
-        <w:t>:</w:t>
+      <w:r>
+        <w:rPr>
+          <w:rFonts w:ascii="Times New Roman" w:hAnsi="Times New Roman" w:cs="Times New Roman"/>
+          <w:sz w:val="26"/>
+          <w:szCs w:val="26"/>
+        </w:rPr>
+        <w:t xml:space="preserve"> th</w:t>
+      </w:r>
+      <w:r>
+        <w:rPr>
+          <w:rFonts w:ascii="Times New Roman" w:hAnsi="Times New Roman" w:cs="Times New Roman"/>
+          <w:sz w:val="26"/>
+          <w:szCs w:val="26"/>
+        </w:rPr>
+        <w:t>ực hành:</w:t>
       </w:r>
     </w:p>
     <w:p>
@@ -631,6 +470,57 @@
                     <a:xfrm>
                       <a:off x="0" y="0"/>
                       <a:ext cx="5943600" cy="3521710"/>
+                    </a:xfrm>
+                    <a:prstGeom prst="rect">
+                      <a:avLst/>
+                    </a:prstGeom>
+                  </pic:spPr>
+                </pic:pic>
+              </a:graphicData>
+            </a:graphic>
+          </wp:inline>
+        </w:drawing>
+      </w:r>
+    </w:p>
+    <w:p>
+      <w:pPr>
+        <w:rPr>
+          <w:rFonts w:ascii="Times New Roman" w:hAnsi="Times New Roman" w:cs="Times New Roman"/>
+          <w:sz w:val="26"/>
+          <w:szCs w:val="26"/>
+        </w:rPr>
+      </w:pPr>
+      <w:r>
+        <w:rPr>
+          <w:rFonts w:ascii="Times New Roman" w:hAnsi="Times New Roman" w:cs="Times New Roman"/>
+          <w:sz w:val="26"/>
+          <w:szCs w:val="26"/>
+        </w:rPr>
+        <w:drawing>
+          <wp:inline distT="0" distB="0" distL="0" distR="0" wp14:anchorId="6DE2B49D" wp14:editId="1624E4F3">
+            <wp:extent cx="5943600" cy="3054350"/>
+            <wp:effectExtent l="0" t="0" r="0" b="0"/>
+            <wp:docPr id="585739152" name="Picture 1"/>
+            <wp:cNvGraphicFramePr>
+              <a:graphicFrameLocks xmlns:a="http://schemas.openxmlformats.org/drawingml/2006/main" noChangeAspect="1"/>
+            </wp:cNvGraphicFramePr>
+            <a:graphic xmlns:a="http://schemas.openxmlformats.org/drawingml/2006/main">
+              <a:graphicData uri="http://schemas.openxmlformats.org/drawingml/2006/picture">
+                <pic:pic xmlns:pic="http://schemas.openxmlformats.org/drawingml/2006/picture">
+                  <pic:nvPicPr>
+                    <pic:cNvPr id="585739152" name=""/>
+                    <pic:cNvPicPr/>
+                  </pic:nvPicPr>
+                  <pic:blipFill>
+                    <a:blip r:embed="rId11"/>
+                    <a:stretch>
+                      <a:fillRect/>
+                    </a:stretch>
+                  </pic:blipFill>
+                  <pic:spPr>
+                    <a:xfrm>
+                      <a:off x="0" y="0"/>
+                      <a:ext cx="5943600" cy="3054350"/>
                     </a:xfrm>
                     <a:prstGeom prst="rect">
                       <a:avLst/>
@@ -1256,6 +1146,7 @@
   <w:style w:type="character" w:default="1" w:styleId="DefaultParagraphFont">
     <w:name w:val="Default Paragraph Font"/>
     <w:uiPriority w:val="1"/>
+    <w:semiHidden/>
     <w:unhideWhenUsed/>
   </w:style>
   <w:style w:type="table" w:default="1" w:styleId="TableNormal">

</xml_diff>